<commit_message>
fix: sync preview mark size with PDF stamp, restore Surat Tugas footer bar
- preview TTD/stempel/logo overlay was fixed 45px while the saved PDF
  stamps at a fixed pt ratio of page height — sizes diverged and drifted
  with viewport width. Both now derive from the same MARK_HEIGHT_PCT.
- unpositioned marks were blanked in preview but rendered inline in the
  saved PDF; preview now only blanks marks that have a dragged position,
  matching generateDoc.
- restore the missing bottom color bar (Shape1) in SURAT_TUGAS.docx,
  dropped somewhere in the retag pipeline — copied from the original
  master, verified byte-identical elsewhere via canonical XML diff.
</commit_message>
<xml_diff>
--- a/templates/docx/SURAT_TUGAS.docx
+++ b/templates/docx/SURAT_TUGAS.docx
@@ -1560,6 +1560,334 @@
           <w:rFonts w:ascii="Arial" w:cs="Arial" w:eastAsia="Arial" w:hAnsi="Arial"/>
         </w:rPr>
       </w:pPr>
+      <w:r>
+        <mc:AlternateContent>
+          <mc:Choice Requires="wpg">
+            <w:drawing>
+              <wp:anchor behindDoc="0" distT="0" distB="0" distL="0" distR="0" simplePos="0" locked="0" layoutInCell="0" allowOverlap="1" relativeHeight="2">
+                <wp:simplePos x="0" y="0"/>
+                <wp:positionH relativeFrom="page">
+                  <wp:posOffset>2410460</wp:posOffset>
+                </wp:positionH>
+                <wp:positionV relativeFrom="margin">
+                  <wp:posOffset>9801860</wp:posOffset>
+                </wp:positionV>
+                <wp:extent cx="5340985" cy="914400"/>
+                <wp:effectExtent l="0" t="0" r="0" b="0"/>
+                <wp:wrapNone/>
+                <wp:docPr id="3" name="Shape1"/>
+                <a:graphic>
+                  <a:graphicData uri="http://schemas.microsoft.com/office/word/2010/wordprocessingGroup">
+                    <wpg:wgp>
+                      <wpg:cNvGrpSpPr/>
+                      <wpg:grpSpPr>
+                        <a:xfrm>
+                          <a:off x="0" y="0"/>
+                          <a:ext cx="5340960" cy="914400"/>
+                          <a:chOff x="0" y="0"/>
+                          <a:chExt cx="5340960" cy="914400"/>
+                        </a:xfrm>
+                      </wpg:grpSpPr>
+                      <wpg:grpSp>
+                        <wpg:cNvGrpSpPr/>
+                        <wpg:grpSpPr>
+                          <a:xfrm>
+                            <a:off x="0" y="0"/>
+                            <a:ext cx="5340960" cy="914400"/>
+                          </a:xfrm>
+                        </wpg:grpSpPr>
+                        <wps:wsp>
+                          <wps:cNvPr id="3" name="Shape 3"/>
+                          <wps:cNvSpPr/>
+                          <wps:spPr>
+                            <a:xfrm>
+                              <a:off x="720" y="720"/>
+                              <a:ext cx="5331600" cy="911160"/>
+                            </a:xfrm>
+                            <a:prstGeom prst="rect">
+                              <a:avLst/>
+                            </a:prstGeom>
+                            <a:noFill/>
+                            <a:ln w="0">
+                              <a:noFill/>
+                            </a:ln>
+                          </wps:spPr>
+                          <wps:style>
+                            <a:lnRef idx="0"/>
+                            <a:fillRef idx="0"/>
+                            <a:effectRef idx="0"/>
+                            <a:fontRef idx="minor"/>
+                          </wps:style>
+                          <wps:txbx>
+                            <w:txbxContent>
+                              <w:p>
+                                <w:pPr>
+                                  <w:spacing w:lineRule="exact" w:line="240" w:before="0" w:after="0"/>
+                                  <w:ind w:hanging="0" w:left="0" w:right="0"/>
+                                  <w:jc w:val="left"/>
+                                  <w:rPr/>
+                                </w:pPr>
+                                <w:r>
+                                  <w:rPr/>
+                                </w:r>
+                              </w:p>
+                            </w:txbxContent>
+                          </wps:txbx>
+                          <wps:bodyPr tIns="91440" bIns="91440" anchor="ctr">
+                            <a:noAutofit/>
+                          </wps:bodyPr>
+                        </wps:wsp>
+                        <wps:wsp>
+                          <wps:cNvPr id="4" name="Shape 4"/>
+                          <wps:cNvSpPr/>
+                          <wps:spPr>
+                            <a:xfrm>
+                              <a:off x="448200" y="0"/>
+                              <a:ext cx="771480" cy="684360"/>
+                            </a:xfrm>
+                            <a:custGeom>
+                              <a:avLst/>
+                              <a:gdLst>
+                                <a:gd name="textAreaLeft" fmla="*/ 0 w 437400"/>
+                                <a:gd name="textAreaRight" fmla="*/ 437760 w 437400"/>
+                                <a:gd name="textAreaTop" fmla="*/ 0 h 388080"/>
+                                <a:gd name="textAreaBottom" fmla="*/ 388440 h 388080"/>
+                              </a:gdLst>
+                              <a:ahLst/>
+                              <a:rect l="textAreaLeft" t="textAreaTop" r="textAreaRight" b="textAreaBottom"/>
+                              <a:pathLst>
+                                <a:path w="920" h="883">
+                                  <a:moveTo>
+                                    <a:pt x="920" y="0"/>
+                                  </a:moveTo>
+                                  <a:lnTo>
+                                    <a:pt x="693" y="0"/>
+                                  </a:lnTo>
+                                  <a:lnTo>
+                                    <a:pt x="0" y="882"/>
+                                  </a:lnTo>
+                                  <a:lnTo>
+                                    <a:pt x="191" y="882"/>
+                                  </a:lnTo>
+                                  <a:lnTo>
+                                    <a:pt x="213" y="879"/>
+                                  </a:lnTo>
+                                  <a:lnTo>
+                                    <a:pt x="228" y="873"/>
+                                  </a:lnTo>
+                                  <a:lnTo>
+                                    <a:pt x="241" y="863"/>
+                                  </a:lnTo>
+                                  <a:lnTo>
+                                    <a:pt x="255" y="848"/>
+                                  </a:lnTo>
+                                  <a:lnTo>
+                                    <a:pt x="920" y="0"/>
+                                  </a:lnTo>
+                                  <a:close/>
+                                </a:path>
+                              </a:pathLst>
+                            </a:custGeom>
+                            <a:solidFill>
+                              <a:srgbClr val="16a2b9"/>
+                            </a:solidFill>
+                            <a:ln w="0">
+                              <a:noFill/>
+                            </a:ln>
+                          </wps:spPr>
+                          <wps:style>
+                            <a:lnRef idx="0"/>
+                            <a:fillRef idx="0"/>
+                            <a:effectRef idx="0"/>
+                            <a:fontRef idx="minor"/>
+                          </wps:style>
+                          <wps:bodyPr/>
+                        </wps:wsp>
+                        <wps:wsp>
+                          <wps:cNvPr id="5" name="Shape 5"/>
+                          <wps:cNvSpPr/>
+                          <wps:spPr>
+                            <a:xfrm>
+                              <a:off x="0" y="161280"/>
+                              <a:ext cx="544320" cy="561960"/>
+                            </a:xfrm>
+                            <a:custGeom>
+                              <a:avLst/>
+                              <a:gdLst>
+                                <a:gd name="textAreaLeft" fmla="*/ 0 w 308520"/>
+                                <a:gd name="textAreaRight" fmla="*/ 308880 w 308520"/>
+                                <a:gd name="textAreaTop" fmla="*/ 0 h 318600"/>
+                                <a:gd name="textAreaBottom" fmla="*/ 318960 h 318600"/>
+                              </a:gdLst>
+                              <a:ahLst/>
+                              <a:rect l="textAreaLeft" t="textAreaTop" r="textAreaRight" b="textAreaBottom"/>
+                              <a:pathLst>
+                                <a:path w="649" h="725">
+                                  <a:moveTo>
+                                    <a:pt x="649" y="0"/>
+                                  </a:moveTo>
+                                  <a:lnTo>
+                                    <a:pt x="569" y="0"/>
+                                  </a:lnTo>
+                                  <a:lnTo>
+                                    <a:pt x="0" y="725"/>
+                                  </a:lnTo>
+                                  <a:lnTo>
+                                    <a:pt x="43" y="725"/>
+                                  </a:lnTo>
+                                  <a:lnTo>
+                                    <a:pt x="65" y="722"/>
+                                  </a:lnTo>
+                                  <a:lnTo>
+                                    <a:pt x="80" y="716"/>
+                                  </a:lnTo>
+                                  <a:lnTo>
+                                    <a:pt x="93" y="706"/>
+                                  </a:lnTo>
+                                  <a:lnTo>
+                                    <a:pt x="107" y="691"/>
+                                  </a:lnTo>
+                                  <a:lnTo>
+                                    <a:pt x="649" y="0"/>
+                                  </a:lnTo>
+                                  <a:close/>
+                                </a:path>
+                              </a:pathLst>
+                            </a:custGeom>
+                            <a:solidFill>
+                              <a:srgbClr val="f5ec12"/>
+                            </a:solidFill>
+                            <a:ln w="0">
+                              <a:noFill/>
+                            </a:ln>
+                          </wps:spPr>
+                          <wps:style>
+                            <a:lnRef idx="0"/>
+                            <a:fillRef idx="0"/>
+                            <a:effectRef idx="0"/>
+                            <a:fontRef idx="minor"/>
+                          </wps:style>
+                          <wps:bodyPr/>
+                        </wps:wsp>
+                        <wps:wsp>
+                          <wps:cNvPr id="6" name="Shape 6"/>
+                          <wps:cNvSpPr/>
+                          <wps:spPr>
+                            <a:xfrm>
+                              <a:off x="720" y="196200"/>
+                              <a:ext cx="5340240" cy="718200"/>
+                            </a:xfrm>
+                            <a:custGeom>
+                              <a:avLst/>
+                              <a:gdLst>
+                                <a:gd name="textAreaLeft" fmla="*/ 0 w 3027600"/>
+                                <a:gd name="textAreaRight" fmla="*/ 3027960 w 3027600"/>
+                                <a:gd name="textAreaTop" fmla="*/ 0 h 407160"/>
+                                <a:gd name="textAreaBottom" fmla="*/ 407520 h 407160"/>
+                              </a:gdLst>
+                              <a:ahLst/>
+                              <a:rect l="textAreaLeft" t="textAreaTop" r="textAreaRight" b="textAreaBottom"/>
+                              <a:pathLst>
+                                <a:path w="6360" h="926">
+                                  <a:moveTo>
+                                    <a:pt x="809" y="140"/>
+                                  </a:moveTo>
+                                  <a:lnTo>
+                                    <a:pt x="614" y="140"/>
+                                  </a:lnTo>
+                                  <a:lnTo>
+                                    <a:pt x="0" y="925"/>
+                                  </a:lnTo>
+                                  <a:lnTo>
+                                    <a:pt x="195" y="925"/>
+                                  </a:lnTo>
+                                  <a:lnTo>
+                                    <a:pt x="809" y="140"/>
+                                  </a:lnTo>
+                                  <a:close/>
+                                  <a:moveTo>
+                                    <a:pt x="6360" y="922"/>
+                                  </a:moveTo>
+                                  <a:lnTo>
+                                    <a:pt x="6357" y="0"/>
+                                  </a:lnTo>
+                                  <a:lnTo>
+                                    <a:pt x="1619" y="2"/>
+                                  </a:lnTo>
+                                  <a:lnTo>
+                                    <a:pt x="1543" y="12"/>
+                                  </a:lnTo>
+                                  <a:lnTo>
+                                    <a:pt x="1475" y="39"/>
+                                  </a:lnTo>
+                                  <a:lnTo>
+                                    <a:pt x="1416" y="79"/>
+                                  </a:lnTo>
+                                  <a:lnTo>
+                                    <a:pt x="1371" y="126"/>
+                                  </a:lnTo>
+                                  <a:lnTo>
+                                    <a:pt x="757" y="925"/>
+                                  </a:lnTo>
+                                  <a:lnTo>
+                                    <a:pt x="6360" y="922"/>
+                                  </a:lnTo>
+                                  <a:close/>
+                                </a:path>
+                              </a:pathLst>
+                            </a:custGeom>
+                            <a:solidFill>
+                              <a:srgbClr val="155a73"/>
+                            </a:solidFill>
+                            <a:ln w="0">
+                              <a:noFill/>
+                            </a:ln>
+                          </wps:spPr>
+                          <wps:style>
+                            <a:lnRef idx="0"/>
+                            <a:fillRef idx="0"/>
+                            <a:effectRef idx="0"/>
+                            <a:fontRef idx="minor"/>
+                          </wps:style>
+                          <wps:bodyPr/>
+                        </wps:wsp>
+                      </wpg:grpSp>
+                    </wpg:wgp>
+                  </a:graphicData>
+                </a:graphic>
+              </wp:anchor>
+            </w:drawing>
+          </mc:Choice>
+          <mc:Fallback>
+            <w:pict>
+              <v:group id="shape_0" alt="Shape1" style="position:absolute;margin-left:189.8pt;margin-top:771.8pt;width:420.55pt;height:72pt" coordorigin="3796,15436" coordsize="8411,1440">
+                <v:group id="shape_0" style="position:absolute;left:3796;top:15436;width:8411;height:1440">
+                  <v:rect id="shape_0" ID="Shape 3" path="m0,0l-2147483645,0l-2147483645,-2147483646l0,-2147483646xe" stroked="f" o:allowincell="f" style="position:absolute;left:3797;top:15437;width:8395;height:1434;mso-wrap-style:none;v-text-anchor:middle;mso-position-horizontal-relative:page;mso-position-vertical-relative:margin">
+                    <v:fill o:detectmouseclick="t" on="false"/>
+                    <v:stroke color="#3465a4" joinstyle="round" endcap="flat"/>
+                    <v:textbox>
+                      <w:txbxContent>
+                        <w:p>
+                          <w:pPr>
+                            <w:spacing w:lineRule="exact" w:line="240" w:before="0" w:after="0"/>
+                            <w:ind w:hanging="0" w:left="0" w:right="0"/>
+                            <w:jc w:val="left"/>
+                            <w:rPr/>
+                          </w:pPr>
+                          <w:r>
+                            <w:rPr/>
+                          </w:r>
+                        </w:p>
+                      </w:txbxContent>
+                    </v:textbox>
+                    <w10:wrap type="none"/>
+                  </v:rect>
+                </v:group>
+              </v:group>
+            </w:pict>
+          </mc:Fallback>
+        </mc:AlternateContent>
+      </w:r>
       <w:r>
         <w:rPr/>
         <w:t>{namaPemberi}</w:t>

</xml_diff>